<commit_message>
docs: actualizar manual de usuario (v1.1)
Amplia la seccion del asistente: chat con memoria de la conversacion
(responder solo el dato pedido, tolerancia a variantes y typos) y la
parte nueva de dictado por voz. Anade una fila de solucion de problemas.

Co-Authored-By: Claude Opus 4.8 <noreply@anthropic.com>
</commit_message>
<xml_diff>
--- a/docs/Manual_de_Usuario_Citas_Medicas.docx
+++ b/docs/Manual_de_Usuario_Citas_Medicas.docx
@@ -74,7 +74,7 @@
           <w:sz w:val="22"/>
           <w:szCs w:val="22"/>
         </w:rPr>
-        <w:t xml:space="preserve">Versión 1.0</w:t>
+        <w:t xml:space="preserve">Versión 1.1</w:t>
       </w:r>
     </w:p>
     <w:p>
@@ -1339,7 +1339,7 @@
           <w:sz w:val="22"/>
           <w:szCs w:val="22"/>
         </w:rPr>
-        <w:t xml:space="preserve">Desde la pantalla de inicio, pulse "Reservar con asistente". Escriba lo que necesita con sus propias palabras. No hace falta decirlo todo de golpe: el asistente le irá preguntando lo que falte.</w:t>
+        <w:t xml:space="preserve">Desde la pantalla de inicio, pulse "Reservar conversando". Escriba (o dicte) lo que necesita con sus propias palabras. No hace falta decirlo todo de golpe: el asistente le irá preguntando lo que falte y recuerda lo que usted ya dijo.</w:t>
       </w:r>
     </w:p>
     <w:p>
@@ -1438,7 +1438,7 @@
           <w:sz w:val="22"/>
           <w:szCs w:val="22"/>
         </w:rPr>
-        <w:t xml:space="preserve">Si falta la especialidad o el día, respóndalo cuando el asistente lo pregunte.</w:t>
+        <w:t xml:space="preserve">Si falta la especialidad o el día, responda cuando el asistente lo pregunte. Basta con el dato: por ejemplo "Medicina General" o "mañana".</w:t>
       </w:r>
     </w:p>
     <w:p>
@@ -1514,7 +1514,7 @@
                 <w:sz w:val="22"/>
                 <w:szCs w:val="22"/>
               </w:rPr>
-              <w:t xml:space="preserve">Importante — orientación médica</w:t>
+              <w:t xml:space="preserve">El asistente recuerda la conversación</w:t>
             </w:r>
           </w:p>
           <w:p>
@@ -1523,7 +1523,7 @@
                 <w:sz w:val="22"/>
                 <w:szCs w:val="22"/>
               </w:rPr>
-              <w:t xml:space="preserve">El asistente no diagnostica ni recomienda especialidades a partir de síntomas. Si usted escribe algo como "me duele la cabeza", lo derivará al canal de atención de la clínica para que lo oriente el personal de salud. Es una regla de seguridad (RN-09).</w:t>
+              <w:t xml:space="preserve">No necesita repetir todo en cada mensaje. Cuando le pregunte la especialidad, responda solo su nombre: entiende variantes habituales (por ejemplo "pediatra" por Pediatría, o "cardio" por Cardiología) y tolera pequeños errores de tecleo.</w:t>
             </w:r>
           </w:p>
         </w:tc>
@@ -1568,7 +1568,7 @@
                 <w:sz w:val="22"/>
                 <w:szCs w:val="22"/>
               </w:rPr>
-              <w:t xml:space="preserve">Si no logra entenderle</w:t>
+              <w:t xml:space="preserve">Importante — orientación médica</w:t>
             </w:r>
           </w:p>
           <w:p>
@@ -1577,7 +1577,210 @@
                 <w:sz w:val="22"/>
                 <w:szCs w:val="22"/>
               </w:rPr>
+              <w:t xml:space="preserve">El asistente no diagnostica ni recomienda especialidades a partir de síntomas. Si usted escribe algo como "me duele la cabeza", lo derivará al canal de atención de la clínica para que lo oriente el personal de salud. Es una regla de seguridad (RN-09).</w:t>
+            </w:r>
+          </w:p>
+        </w:tc>
+      </w:tr>
+    </w:tbl>
+    <w:tbl>
+      <w:tblPr>
+        <w:tblW w:type="dxa" w:w="9360"/>
+        <w:tblBorders>
+          <w:top w:val="single" w:color="1565C0" w:sz="2"/>
+          <w:left w:val="single" w:color="1565C0" w:sz="12"/>
+          <w:bottom w:val="single" w:color="1565C0" w:sz="2"/>
+          <w:right w:val="single" w:color="1565C0" w:sz="2"/>
+          <w:insideH w:val="none"/>
+          <w:insideV w:val="none"/>
+        </w:tblBorders>
+      </w:tblPr>
+      <w:tblGrid>
+        <w:gridCol w:w="9360"/>
+      </w:tblGrid>
+      <w:tr>
+        <w:tc>
+          <w:tcPr>
+            <w:tcW w:type="dxa" w:w="9360"/>
+            <w:shd w:fill="E3F0FC" w:color="auto" w:val="clear"/>
+            <w:tcMar>
+              <w:top w:type="dxa" w:w="120"/>
+              <w:left w:type="dxa" w:w="160"/>
+              <w:bottom w:type="dxa" w:w="120"/>
+              <w:right w:type="dxa" w:w="160"/>
+            </w:tcMar>
+          </w:tcPr>
+          <w:p>
+            <w:pPr>
+              <w:spacing w:after="40"/>
+            </w:pPr>
+            <w:r>
+              <w:rPr>
+                <w:b/>
+                <w:bCs/>
+                <w:color w:val="1565C0"/>
+                <w:sz w:val="22"/>
+                <w:szCs w:val="22"/>
+              </w:rPr>
+              <w:t xml:space="preserve">Si no logra entenderle</w:t>
+            </w:r>
+          </w:p>
+          <w:p>
+            <w:r>
+              <w:rPr>
+                <w:sz w:val="22"/>
+                <w:szCs w:val="22"/>
+              </w:rPr>
               <w:t xml:space="preserve">Tras un par de intentos sin éxito, el asistente le ofrecerá continuar con el flujo guiado por menús, que siempre permite completar la reserva.</w:t>
+            </w:r>
+          </w:p>
+        </w:tc>
+      </w:tr>
+    </w:tbl>
+    <w:p>
+      <w:pPr>
+        <w:spacing w:after="80" w:before="160"/>
+      </w:pPr>
+      <w:r>
+        <w:rPr>
+          <w:b/>
+          <w:bCs/>
+          <w:color w:val="1565C0"/>
+          <w:sz w:val="24"/>
+          <w:szCs w:val="24"/>
+        </w:rPr>
+        <w:t xml:space="preserve">Dictado por voz (hablar en vez de escribir)</w:t>
+      </w:r>
+    </w:p>
+    <w:p>
+      <w:pPr>
+        <w:spacing w:after="120" w:line="276"/>
+      </w:pPr>
+      <w:r>
+        <w:rPr>
+          <w:sz w:val="22"/>
+          <w:szCs w:val="22"/>
+        </w:rPr>
+        <w:t xml:space="preserve">En el teléfono puede dictar su mensaje en lugar de escribirlo. Junto al campo de texto del chat hay un botón de micrófono.</w:t>
+      </w:r>
+    </w:p>
+    <w:p>
+      <w:pPr>
+        <w:pStyle w:val="ListParagraph"/>
+        <w:numPr>
+          <w:ilvl w:val="0"/>
+          <w:numId w:val="3"/>
+        </w:numPr>
+        <w:spacing w:after="90" w:line="270"/>
+      </w:pPr>
+      <w:r>
+        <w:rPr>
+          <w:sz w:val="22"/>
+          <w:szCs w:val="22"/>
+        </w:rPr>
+        <w:t xml:space="preserve">Pulse el icono de micrófono que está al lado del campo de texto.</w:t>
+      </w:r>
+    </w:p>
+    <w:p>
+      <w:pPr>
+        <w:pStyle w:val="ListParagraph"/>
+        <w:numPr>
+          <w:ilvl w:val="0"/>
+          <w:numId w:val="3"/>
+        </w:numPr>
+        <w:spacing w:after="90" w:line="270"/>
+      </w:pPr>
+      <w:r>
+        <w:rPr>
+          <w:sz w:val="22"/>
+          <w:szCs w:val="22"/>
+        </w:rPr>
+        <w:t xml:space="preserve">La primera vez, el teléfono le pedirá permiso para usar el micrófono: acéptelo.</w:t>
+      </w:r>
+    </w:p>
+    <w:p>
+      <w:pPr>
+        <w:pStyle w:val="ListParagraph"/>
+        <w:numPr>
+          <w:ilvl w:val="0"/>
+          <w:numId w:val="3"/>
+        </w:numPr>
+        <w:spacing w:after="90" w:line="270"/>
+      </w:pPr>
+      <w:r>
+        <w:rPr>
+          <w:sz w:val="22"/>
+          <w:szCs w:val="22"/>
+        </w:rPr>
+        <w:t xml:space="preserve">Hable con naturalidad; lo que diga va apareciendo en el campo de texto.</w:t>
+      </w:r>
+    </w:p>
+    <w:p>
+      <w:pPr>
+        <w:pStyle w:val="ListParagraph"/>
+        <w:numPr>
+          <w:ilvl w:val="0"/>
+          <w:numId w:val="3"/>
+        </w:numPr>
+        <w:spacing w:after="90" w:line="270"/>
+      </w:pPr>
+      <w:r>
+        <w:rPr>
+          <w:sz w:val="22"/>
+          <w:szCs w:val="22"/>
+        </w:rPr>
+        <w:t xml:space="preserve">Pulse de nuevo el micrófono para detener, revise el texto y pulse enviar.</w:t>
+      </w:r>
+    </w:p>
+    <w:tbl>
+      <w:tblPr>
+        <w:tblW w:type="dxa" w:w="9360"/>
+        <w:tblBorders>
+          <w:top w:val="single" w:color="1565C0" w:sz="2"/>
+          <w:left w:val="single" w:color="1565C0" w:sz="12"/>
+          <w:bottom w:val="single" w:color="1565C0" w:sz="2"/>
+          <w:right w:val="single" w:color="1565C0" w:sz="2"/>
+          <w:insideH w:val="none"/>
+          <w:insideV w:val="none"/>
+        </w:tblBorders>
+      </w:tblPr>
+      <w:tblGrid>
+        <w:gridCol w:w="9360"/>
+      </w:tblGrid>
+      <w:tr>
+        <w:tc>
+          <w:tcPr>
+            <w:tcW w:type="dxa" w:w="9360"/>
+            <w:shd w:fill="E3F0FC" w:color="auto" w:val="clear"/>
+            <w:tcMar>
+              <w:top w:type="dxa" w:w="120"/>
+              <w:left w:type="dxa" w:w="160"/>
+              <w:bottom w:type="dxa" w:w="120"/>
+              <w:right w:type="dxa" w:w="160"/>
+            </w:tcMar>
+          </w:tcPr>
+          <w:p>
+            <w:pPr>
+              <w:spacing w:after="40"/>
+            </w:pPr>
+            <w:r>
+              <w:rPr>
+                <w:b/>
+                <w:bCs/>
+                <w:color w:val="1565C0"/>
+                <w:sz w:val="22"/>
+                <w:szCs w:val="22"/>
+              </w:rPr>
+              <w:t xml:space="preserve">Sobre el dictado</w:t>
+            </w:r>
+          </w:p>
+          <w:p>
+            <w:r>
+              <w:rPr>
+                <w:sz w:val="22"/>
+                <w:szCs w:val="22"/>
+              </w:rPr>
+              <w:t xml:space="preserve">El dictado usa el reconocimiento de voz del propio teléfono; su audio no se envía a ningún servidor. Nada se envía por voz de forma automática: usted siempre revisa el texto antes de enviarlo. Si el dispositivo no tiene reconocimiento de voz, el botón lo avisa y usted puede escribir con normalidad.</w:t>
             </w:r>
           </w:p>
         </w:tc>
@@ -3122,6 +3325,50 @@
                 <w:szCs w:val="21"/>
               </w:rPr>
               <w:t xml:space="preserve">Elija otra fecha; la clínica no atiende domingos.</w:t>
+            </w:r>
+          </w:p>
+        </w:tc>
+      </w:tr>
+      <w:tr>
+        <w:tc>
+          <w:tcPr>
+            <w:tcW w:type="dxa" w:w="3200"/>
+            <w:shd w:fill="F1F3F4" w:color="auto" w:val="clear"/>
+            <w:tcMar>
+              <w:top w:type="dxa" w:w="70"/>
+              <w:left w:type="dxa" w:w="120"/>
+              <w:bottom w:type="dxa" w:w="70"/>
+              <w:right w:type="dxa" w:w="120"/>
+            </w:tcMar>
+          </w:tcPr>
+          <w:p>
+            <w:r>
+              <w:rPr>
+                <w:sz w:val="21"/>
+                <w:szCs w:val="21"/>
+              </w:rPr>
+              <w:t xml:space="preserve">El micrófono no dicta</w:t>
+            </w:r>
+          </w:p>
+        </w:tc>
+        <w:tc>
+          <w:tcPr>
+            <w:tcW w:type="dxa" w:w="6160"/>
+            <w:shd w:fill="F1F3F4" w:color="auto" w:val="clear"/>
+            <w:tcMar>
+              <w:top w:type="dxa" w:w="70"/>
+              <w:left w:type="dxa" w:w="120"/>
+              <w:bottom w:type="dxa" w:w="70"/>
+              <w:right w:type="dxa" w:w="120"/>
+            </w:tcMar>
+          </w:tcPr>
+          <w:p>
+            <w:r>
+              <w:rPr>
+                <w:sz w:val="21"/>
+                <w:szCs w:val="21"/>
+              </w:rPr>
+              <w:t xml:space="preserve">Permita el acceso al micrófono cuando el teléfono lo pida. Si el dispositivo no tiene reconocimiento de voz, escriba el mensaje; el botón lo avisa.</w:t>
             </w:r>
           </w:p>
         </w:tc>

</xml_diff>